<commit_message>
Improve recruitment offer PDF layout and appointment letter flow after accept.
Widen offer-letter table columns for LibreOffice PDF fidelity, show accepted offers under Appointment letters with generate/send email, and open send after appointment generate.
</commit_message>
<xml_diff>
--- a/public/templates/admin-recruitment/offer-letter.docx
+++ b/public/templates/admin-recruitment/offer-letter.docx
@@ -206,7 +206,7 @@
     </w:p>
     <w:tbl>
       <w:tblPr>
-        <w:tblW w:w="0" w:type="auto"/>
+        <w:tblW w:w="5600" w:type="dxa"/>
         <w:tblCellSpacing w:w="15" w:type="dxa"/>
         <w:tblCellMar>
           <w:top w:w="15" w:type="dxa"/>
@@ -217,8 +217,8 @@
         <w:tblLook w:val="04A0" w:firstRow="1" w:lastRow="0" w:firstColumn="1" w:lastColumn="0" w:noHBand="0" w:noVBand="1"/>
       </w:tblPr>
       <w:tblGrid>
-        <w:gridCol w:w="1437"/>
-        <w:gridCol w:w="2317"/>
+        <w:gridCol w:w="2400"/>
+        <w:gridCol w:w="3200"/>
       </w:tblGrid>
       <w:tr>
         <w:trPr>
@@ -227,25 +227,25 @@
         </w:trPr>
         <w:tc>
           <w:tcPr>
-            <w:tcW w:w="0" w:type="auto"/>
+            <w:tcW w:w="2400" w:type="dxa"/>
             <w:vAlign w:val="center"/>
             <w:hideMark/>
           </w:tcPr>
           <w:p>
             <w:pPr>
-              <w:spacing w:after="160" w:line="278" w:lineRule="auto"/>
+              <w:spacing w:after="0" w:line="240" w:lineRule="auto"/>
             </w:pPr>
           </w:p>
         </w:tc>
         <w:tc>
           <w:tcPr>
-            <w:tcW w:w="0" w:type="auto"/>
+            <w:tcW w:w="3200" w:type="dxa"/>
             <w:vAlign w:val="center"/>
             <w:hideMark/>
           </w:tcPr>
           <w:p>
             <w:pPr>
-              <w:spacing w:after="160" w:line="278" w:lineRule="auto"/>
+              <w:spacing w:after="0" w:line="240" w:lineRule="auto"/>
             </w:pPr>
           </w:p>
         </w:tc>
@@ -256,13 +256,15 @@
         </w:trPr>
         <w:tc>
           <w:tcPr>
-            <w:tcW w:w="0" w:type="auto"/>
+            <w:tcW w:w="2400" w:type="dxa"/>
             <w:vAlign w:val="center"/>
             <w:hideMark/>
           </w:tcPr>
           <w:p>
             <w:pPr>
-              <w:spacing w:after="160" w:line="278" w:lineRule="auto"/>
+              <w:keepLines/>
+              <w:wordWrap w:val="0"/>
+              <w:spacing w:after="80" w:line="240" w:lineRule="auto"/>
             </w:pPr>
             <w:r>
               <w:rPr>
@@ -275,13 +277,14 @@
         </w:tc>
         <w:tc>
           <w:tcPr>
-            <w:tcW w:w="0" w:type="auto"/>
+            <w:tcW w:w="3200" w:type="dxa"/>
             <w:vAlign w:val="center"/>
             <w:hideMark/>
           </w:tcPr>
           <w:p>
             <w:pPr>
-              <w:spacing w:after="160" w:line="278" w:lineRule="auto"/>
+              <w:keepLines/>
+              <w:spacing w:after="80" w:line="240" w:lineRule="auto"/>
             </w:pPr>
             <w:r>
               <w:t>{{DESIGNATION}}</w:t>
@@ -295,13 +298,15 @@
         </w:trPr>
         <w:tc>
           <w:tcPr>
-            <w:tcW w:w="0" w:type="auto"/>
+            <w:tcW w:w="2400" w:type="dxa"/>
             <w:vAlign w:val="center"/>
             <w:hideMark/>
           </w:tcPr>
           <w:p>
             <w:pPr>
-              <w:spacing w:after="160" w:line="278" w:lineRule="auto"/>
+              <w:keepLines/>
+              <w:wordWrap w:val="0"/>
+              <w:spacing w:after="80" w:line="240" w:lineRule="auto"/>
             </w:pPr>
             <w:r>
               <w:rPr>
@@ -314,13 +319,14 @@
         </w:tc>
         <w:tc>
           <w:tcPr>
-            <w:tcW w:w="0" w:type="auto"/>
+            <w:tcW w:w="3200" w:type="dxa"/>
             <w:vAlign w:val="center"/>
             <w:hideMark/>
           </w:tcPr>
           <w:p>
             <w:pPr>
-              <w:spacing w:after="160" w:line="278" w:lineRule="auto"/>
+              <w:keepLines/>
+              <w:spacing w:after="80" w:line="240" w:lineRule="auto"/>
             </w:pPr>
             <w:r>
               <w:t>{{JOINING_DATE_LONG}}</w:t>
@@ -334,13 +340,15 @@
         </w:trPr>
         <w:tc>
           <w:tcPr>
-            <w:tcW w:w="0" w:type="auto"/>
+            <w:tcW w:w="2400" w:type="dxa"/>
             <w:vAlign w:val="center"/>
             <w:hideMark/>
           </w:tcPr>
           <w:p>
             <w:pPr>
-              <w:spacing w:after="160" w:line="278" w:lineRule="auto"/>
+              <w:keepLines/>
+              <w:wordWrap w:val="0"/>
+              <w:spacing w:after="80" w:line="240" w:lineRule="auto"/>
             </w:pPr>
             <w:r>
               <w:rPr>
@@ -353,13 +361,14 @@
         </w:tc>
         <w:tc>
           <w:tcPr>
-            <w:tcW w:w="0" w:type="auto"/>
+            <w:tcW w:w="3200" w:type="dxa"/>
             <w:vAlign w:val="center"/>
             <w:hideMark/>
           </w:tcPr>
           <w:p>
             <w:pPr>
-              <w:spacing w:after="160" w:line="278" w:lineRule="auto"/>
+              <w:keepLines/>
+              <w:spacing w:after="80" w:line="240" w:lineRule="auto"/>
             </w:pPr>
             <w:r>
               <w:t>{{LOCATION}}</w:t>
@@ -509,11 +518,18 @@
     </w:p>
     <w:p/>
     <w:p>
+      <w:pPr>
+        <w:keepNext/>
+        <w:keepLines/>
+      </w:pPr>
       <w:r>
         <w:t>I accept the above offer and confirm that I will join on [DD/MM/YYYY]</w:t>
       </w:r>
     </w:p>
     <w:p>
+      <w:pPr>
+        <w:keepLines/>
+      </w:pPr>
       <w:r>
         <w:t>Name: ____________________</w:t>
       </w:r>

</xml_diff>

<commit_message>
changes in offer letter
</commit_message>
<xml_diff>
--- a/public/templates/admin-recruitment/offer-letter.docx
+++ b/public/templates/admin-recruitment/offer-letter.docx
@@ -287,46 +287,11 @@
     </w:p>
     <w:p>
       <w:r>
-        <w:t xml:space="preserve">Please confirm your acceptance by signing and returning a copy of this letter on or before </w:t>
-      </w:r>
-      <w:r>
         <w:rPr>
           <w:b/>
           <w:bCs/>
         </w:rPr>
-        <w:t>{{VALID_UNTIL}}</w:t>
-      </w:r>
-      <w:r>
-        <w:t xml:space="preserve">. </w:t>
-      </w:r>
-      <w:r>
-        <w:t xml:space="preserve">This offer will lapse if your acceptance is not received on or before </w:t>
-      </w:r>
-      <w:r>
-        <w:rPr>
-          <w:b/>
-          <w:bCs/>
-        </w:rPr>
-        <w:t>{{VALID_UNTIL}}</w:t>
-      </w:r>
-      <w:r>
-        <w:t>, or if you fail to join on the agreed date</w:t>
-      </w:r>
-      <w:r>
-        <w:t xml:space="preserve"> (</w:t>
-      </w:r>
-      <w:r>
-        <w:rPr>
-          <w:b/>
-          <w:bCs/>
-        </w:rPr>
-        <w:t>{{JOINING_DATE_SHORT}}</w:t>
-      </w:r>
-      <w:r>
-        <w:t>)</w:t>
-      </w:r>
-      <w:r>
-        <w:t>.</w:t>
+        <w:t xml:space="preserve">You are requested to accept or decline this offer within 24 hours from the date and time of issuance</w:t>
       </w:r>
     </w:p>
     <w:p>
@@ -455,7 +420,14 @@
         <w:keepLines/>
       </w:pPr>
       <w:r>
-        <w:t>I accept the above offer and confirm that I will join on [DD/MM/YYYY]</w:t>
+        <w:rPr>
+          <w:rFonts w:ascii="Cambria" w:hAnsi="Cambria"/>
+          <w:sz w:val="22"/>
+          <w:szCs w:val="22"/>
+          <w:b/>
+          <w:bCs/>
+        </w:rPr>
+        <w:t xml:space="preserve">I accept the above offer and confirm that I will join on {{JOINING_DATE_DDMMYYYY}}</w:t>
       </w:r>
     </w:p>
     <w:p>

</xml_diff>